<commit_message>
DAS con diagrama de actividades
</commit_message>
<xml_diff>
--- a/Fase2/Documentacion/C1 Documento de Arquitectura de Software (DAS).docx
+++ b/Fase2/Documentacion/C1 Documento de Arquitectura de Software (DAS).docx
@@ -243,7 +243,7 @@
     </w:p>
     <w:sdt>
       <w:sdtPr>
-        <w:id w:val="-519006664"/>
+        <w:id w:val="-1701912714"/>
         <w:docPartObj>
           <w:docPartGallery w:val="Table of Contents"/>
           <w:docPartUnique w:val="1"/>
@@ -286,7 +286,7 @@
       </w:pPr>
       <w:sdt>
         <w:sdtPr>
-          <w:id w:val="1187147290"/>
+          <w:id w:val="-1811778974"/>
           <w:tag w:val="goog_rdk_0"/>
         </w:sdtPr>
         <w:sdtContent>
@@ -2889,7 +2889,7 @@
     <w:sdt>
       <w:sdtPr>
         <w:lock w:val="contentLocked"/>
-        <w:id w:val="-45314977"/>
+        <w:id w:val="1499392104"/>
         <w:tag w:val="goog_rdk_1"/>
       </w:sdtPr>
       <w:sdtContent>
@@ -3373,7 +3373,7 @@
     <w:sdt>
       <w:sdtPr>
         <w:lock w:val="contentLocked"/>
-        <w:id w:val="494724927"/>
+        <w:id w:val="-587032454"/>
         <w:tag w:val="goog_rdk_2"/>
       </w:sdtPr>
       <w:sdtContent>
@@ -3691,7 +3691,7 @@
     <w:sdt>
       <w:sdtPr>
         <w:lock w:val="contentLocked"/>
-        <w:id w:val="1049510181"/>
+        <w:id w:val="-427696314"/>
         <w:tag w:val="goog_rdk_4"/>
       </w:sdtPr>
       <w:sdtContent>
@@ -4059,7 +4059,7 @@
                 </w:pPr>
                 <w:sdt>
                   <w:sdtPr>
-                    <w:id w:val="-889588770"/>
+                    <w:id w:val="-1402026077"/>
                     <w:tag w:val="goog_rdk_3"/>
                   </w:sdtPr>
                   <w:sdtContent>
@@ -4098,7 +4098,7 @@
     <w:sdt>
       <w:sdtPr>
         <w:lock w:val="contentLocked"/>
-        <w:id w:val="298120479"/>
+        <w:id w:val="1986653249"/>
         <w:tag w:val="goog_rdk_6"/>
       </w:sdtPr>
       <w:sdtContent>
@@ -4294,7 +4294,7 @@
                 </w:pPr>
                 <w:sdt>
                   <w:sdtPr>
-                    <w:id w:val="-1362025625"/>
+                    <w:id w:val="-692292741"/>
                     <w:tag w:val="goog_rdk_5"/>
                   </w:sdtPr>
                   <w:sdtContent>
@@ -4433,7 +4433,7 @@
     <w:sdt>
       <w:sdtPr>
         <w:lock w:val="contentLocked"/>
-        <w:id w:val="-1704197416"/>
+        <w:id w:val="-1278361505"/>
         <w:tag w:val="goog_rdk_8"/>
       </w:sdtPr>
       <w:sdtContent>
@@ -4629,7 +4629,7 @@
                 </w:pPr>
                 <w:sdt>
                   <w:sdtPr>
-                    <w:id w:val="747806757"/>
+                    <w:id w:val="200437497"/>
                     <w:tag w:val="goog_rdk_7"/>
                   </w:sdtPr>
                   <w:sdtContent>
@@ -4754,7 +4754,7 @@
     <w:sdt>
       <w:sdtPr>
         <w:lock w:val="contentLocked"/>
-        <w:id w:val="-1504081318"/>
+        <w:id w:val="-1948411714"/>
         <w:tag w:val="goog_rdk_9"/>
       </w:sdtPr>
       <w:sdtContent>
@@ -5254,7 +5254,7 @@
     <w:sdt>
       <w:sdtPr>
         <w:lock w:val="contentLocked"/>
-        <w:id w:val="-974683425"/>
+        <w:id w:val="-105483053"/>
         <w:tag w:val="goog_rdk_10"/>
       </w:sdtPr>
       <w:sdtContent>
@@ -6388,12 +6388,12 @@
           <wp:inline distB="114300" distT="114300" distL="114300" distR="114300">
             <wp:extent cx="5943600" cy="5537200"/>
             <wp:effectExtent b="0" l="0" r="0" t="0"/>
-            <wp:docPr id="2" name="image3.png"/>
+            <wp:docPr id="3" name="image5.png"/>
             <a:graphic>
               <a:graphicData uri="http://schemas.openxmlformats.org/drawingml/2006/picture">
                 <pic:pic>
                   <pic:nvPicPr>
-                    <pic:cNvPr id="0" name="image3.png"/>
+                    <pic:cNvPr id="0" name="image5.png"/>
                     <pic:cNvPicPr preferRelativeResize="0"/>
                   </pic:nvPicPr>
                   <pic:blipFill>
@@ -12066,12 +12066,12 @@
           <wp:inline distB="114300" distT="114300" distL="114300" distR="114300">
             <wp:extent cx="6223302" cy="3389216"/>
             <wp:effectExtent b="0" l="0" r="0" t="0"/>
-            <wp:docPr id="6" name="image6.jpg"/>
+            <wp:docPr id="7" name="image7.jpg"/>
             <a:graphic>
               <a:graphicData uri="http://schemas.openxmlformats.org/drawingml/2006/picture">
                 <pic:pic>
                   <pic:nvPicPr>
-                    <pic:cNvPr id="0" name="image6.jpg"/>
+                    <pic:cNvPr id="0" name="image7.jpg"/>
                     <pic:cNvPicPr preferRelativeResize="0"/>
                   </pic:nvPicPr>
                   <pic:blipFill>
@@ -12455,12 +12455,12 @@
           <wp:inline distB="114300" distT="114300" distL="114300" distR="114300">
             <wp:extent cx="5943600" cy="3009900"/>
             <wp:effectExtent b="0" l="0" r="0" t="0"/>
-            <wp:docPr id="5" name="image1.png"/>
+            <wp:docPr id="6" name="image4.png"/>
             <a:graphic>
               <a:graphicData uri="http://schemas.openxmlformats.org/drawingml/2006/picture">
                 <pic:pic>
                   <pic:nvPicPr>
-                    <pic:cNvPr id="0" name="image1.png"/>
+                    <pic:cNvPr id="0" name="image4.png"/>
                     <pic:cNvPicPr preferRelativeResize="0"/>
                   </pic:nvPicPr>
                   <pic:blipFill>
@@ -12535,7 +12535,7 @@
     <w:sdt>
       <w:sdtPr>
         <w:lock w:val="contentLocked"/>
-        <w:id w:val="1378110214"/>
+        <w:id w:val="-917973175"/>
         <w:tag w:val="goog_rdk_11"/>
       </w:sdtPr>
       <w:sdtContent>
@@ -17271,7 +17271,7 @@
     <w:sdt>
       <w:sdtPr>
         <w:lock w:val="contentLocked"/>
-        <w:id w:val="1828668449"/>
+        <w:id w:val="697320712"/>
         <w:tag w:val="goog_rdk_12"/>
       </w:sdtPr>
       <w:sdtContent>
@@ -23666,12 +23666,12 @@
           <wp:inline distB="114300" distT="114300" distL="114300" distR="114300">
             <wp:extent cx="5781675" cy="5038725"/>
             <wp:effectExtent b="0" l="0" r="0" t="0"/>
-            <wp:docPr id="3" name="image4.png"/>
+            <wp:docPr id="4" name="image2.png"/>
             <a:graphic>
               <a:graphicData uri="http://schemas.openxmlformats.org/drawingml/2006/picture">
                 <pic:pic>
                   <pic:nvPicPr>
-                    <pic:cNvPr id="0" name="image4.png"/>
+                    <pic:cNvPr id="0" name="image2.png"/>
                     <pic:cNvPicPr preferRelativeResize="0"/>
                   </pic:nvPicPr>
                   <pic:blipFill>
@@ -24876,12 +24876,12 @@
           <wp:inline distB="114300" distT="114300" distL="114300" distR="114300">
             <wp:extent cx="5943600" cy="3911600"/>
             <wp:effectExtent b="0" l="0" r="0" t="0"/>
-            <wp:docPr id="4" name="image5.png"/>
+            <wp:docPr id="5" name="image6.png"/>
             <a:graphic>
               <a:graphicData uri="http://schemas.openxmlformats.org/drawingml/2006/picture">
                 <pic:pic>
                   <pic:nvPicPr>
-                    <pic:cNvPr id="0" name="image5.png"/>
+                    <pic:cNvPr id="0" name="image6.png"/>
                     <pic:cNvPicPr preferRelativeResize="0"/>
                   </pic:nvPicPr>
                   <pic:blipFill>
@@ -25480,7 +25480,7 @@
           <w:color w:val="7f7f7f"/>
           <w:rtl w:val="0"/>
         </w:rPr>
-        <w:t xml:space="preserve">Esta vista muestra cómo interactúan en el tiempo los actores y los componentes del sistema durante su flujo principal: el registro de una ficha de atención. Está dirigida al equipo de desarrollo y a los docentes evaluadores. </w:t>
+        <w:t xml:space="preserve">Esta vista muestra cómo se desarrolla el flujo principal del sistema, que es la atención de un cliente y su seguimiento posterior. El diagrama de actividad describe los pasos del proceso y sus decisiones. El diagrama de secuencia muestra cómo interactúan en el tiempo los actores y los componentes durante el registro de la ficha de atención. Está dirigida al equipo de desarrollo y a los docentes evaluadores. </w:t>
       </w:r>
       <w:r>
         <w:rPr>
@@ -25508,18 +25508,387 @@
     </w:p>
     <w:p>
       <w:pPr>
+        <w:rPr/>
+      </w:pPr>
+      <w:r>
+        <w:rPr/>
+        <w:drawing>
+          <wp:inline distB="114300" distT="114300" distL="114300" distR="114300">
+            <wp:extent cx="5943600" cy="3606800"/>
+            <wp:effectExtent b="0" l="0" r="0" t="0"/>
+            <wp:docPr id="2" name="image1.png"/>
+            <a:graphic>
+              <a:graphicData uri="http://schemas.openxmlformats.org/drawingml/2006/picture">
+                <pic:pic>
+                  <pic:nvPicPr>
+                    <pic:cNvPr id="0" name="image1.png"/>
+                    <pic:cNvPicPr preferRelativeResize="0"/>
+                  </pic:nvPicPr>
+                  <pic:blipFill>
+                    <a:blip r:embed="rId13"/>
+                    <a:srcRect b="0" l="0" r="0" t="0"/>
+                    <a:stretch>
+                      <a:fillRect/>
+                    </a:stretch>
+                  </pic:blipFill>
+                  <pic:spPr>
+                    <a:xfrm>
+                      <a:off x="0" y="0"/>
+                      <a:ext cx="5943600" cy="3606800"/>
+                    </a:xfrm>
+                    <a:prstGeom prst="rect"/>
+                    <a:ln/>
+                  </pic:spPr>
+                </pic:pic>
+              </a:graphicData>
+            </a:graphic>
+          </wp:inline>
+        </w:drawing>
+      </w:r>
+      <w:r>
+        <w:rPr>
+          <w:rtl w:val="0"/>
+        </w:rPr>
+      </w:r>
+    </w:p>
+    <w:p>
+      <w:pPr>
+        <w:rPr/>
+      </w:pPr>
+      <w:r>
+        <w:rPr>
+          <w:rtl w:val="0"/>
+        </w:rPr>
+      </w:r>
+    </w:p>
+    <w:p>
+      <w:pPr>
+        <w:rPr/>
+      </w:pPr>
+      <w:r>
+        <w:rPr>
+          <w:rtl w:val="0"/>
+        </w:rPr>
+      </w:r>
+    </w:p>
+    <w:p>
+      <w:pPr>
+        <w:rPr/>
+      </w:pPr>
+      <w:r>
+        <w:rPr>
+          <w:rtl w:val="0"/>
+        </w:rPr>
+      </w:r>
+    </w:p>
+    <w:p>
+      <w:pPr>
+        <w:rPr/>
+      </w:pPr>
+      <w:r>
+        <w:rPr>
+          <w:rtl w:val="0"/>
+        </w:rPr>
+      </w:r>
+    </w:p>
+    <w:p>
+      <w:pPr>
+        <w:rPr/>
+      </w:pPr>
+      <w:r>
+        <w:rPr>
+          <w:rtl w:val="0"/>
+        </w:rPr>
+      </w:r>
+    </w:p>
+    <w:p>
+      <w:pPr>
+        <w:rPr/>
+      </w:pPr>
+      <w:r>
+        <w:rPr>
+          <w:rtl w:val="0"/>
+        </w:rPr>
+      </w:r>
+    </w:p>
+    <w:p>
+      <w:pPr>
+        <w:rPr/>
+      </w:pPr>
+      <w:r>
+        <w:rPr>
+          <w:rtl w:val="0"/>
+        </w:rPr>
+      </w:r>
+    </w:p>
+    <w:p>
+      <w:pPr>
+        <w:rPr/>
+      </w:pPr>
+      <w:r>
+        <w:rPr>
+          <w:rtl w:val="0"/>
+        </w:rPr>
+      </w:r>
+    </w:p>
+    <w:p>
+      <w:pPr>
+        <w:rPr/>
+      </w:pPr>
+      <w:r>
+        <w:rPr>
+          <w:rtl w:val="0"/>
+        </w:rPr>
+      </w:r>
+    </w:p>
+    <w:p>
+      <w:pPr>
+        <w:rPr/>
+      </w:pPr>
+      <w:r>
+        <w:rPr>
+          <w:rtl w:val="0"/>
+        </w:rPr>
+      </w:r>
+    </w:p>
+    <w:p>
+      <w:pPr>
+        <w:rPr/>
+      </w:pPr>
+      <w:r>
+        <w:rPr>
+          <w:rtl w:val="0"/>
+        </w:rPr>
+      </w:r>
+    </w:p>
+    <w:p>
+      <w:pPr>
+        <w:rPr/>
+      </w:pPr>
+      <w:r>
+        <w:rPr>
+          <w:rtl w:val="0"/>
+        </w:rPr>
+      </w:r>
+    </w:p>
+    <w:p>
+      <w:pPr>
+        <w:rPr/>
+      </w:pPr>
+      <w:r>
+        <w:rPr>
+          <w:rtl w:val="0"/>
+        </w:rPr>
+      </w:r>
+    </w:p>
+    <w:p>
+      <w:pPr>
+        <w:pStyle w:val="Heading3"/>
+        <w:rPr/>
+      </w:pPr>
+      <w:r>
+        <w:rPr>
+          <w:rtl w:val="0"/>
+        </w:rPr>
+        <w:t xml:space="preserve">4.4.3. Descripción del diagrama de actividad</w:t>
+      </w:r>
+    </w:p>
+    <w:p>
+      <w:pPr>
+        <w:spacing w:after="240" w:before="240" w:lineRule="auto"/>
+        <w:rPr/>
+      </w:pPr>
+      <w:r>
+        <w:rPr>
+          <w:rtl w:val="0"/>
+        </w:rPr>
+        <w:t xml:space="preserve">El diagrama representa el flujo completo de una atención, desde que se busca al cliente hasta que se registra su valoración de seguimiento.</w:t>
+      </w:r>
+    </w:p>
+    <w:p>
+      <w:pPr>
+        <w:numPr>
+          <w:ilvl w:val="0"/>
+          <w:numId w:val="7"/>
+        </w:numPr>
+        <w:spacing w:after="0" w:afterAutospacing="0" w:before="240" w:lineRule="auto"/>
+        <w:ind w:left="720" w:hanging="360"/>
+        <w:rPr/>
+      </w:pPr>
+      <w:r>
+        <w:rPr>
+          <w:b w:val="1"/>
+          <w:bCs w:val="1"/>
+          <w:rtl w:val="0"/>
+        </w:rPr>
+        <w:t xml:space="preserve">Identificación del cliente.</w:t>
+      </w:r>
+      <w:r>
+        <w:rPr>
+          <w:rtl w:val="0"/>
+        </w:rPr>
+        <w:t xml:space="preserve"> El proceso parte con la búsqueda del cliente. Si no existe, se registra en ese momento y el flujo continúa de la misma forma.</w:t>
+      </w:r>
+    </w:p>
+    <w:p>
+      <w:pPr>
+        <w:numPr>
+          <w:ilvl w:val="0"/>
+          <w:numId w:val="7"/>
+        </w:numPr>
+        <w:spacing w:after="0" w:afterAutospacing="0" w:before="0" w:beforeAutospacing="0" w:lineRule="auto"/>
+        <w:ind w:left="720" w:hanging="360"/>
+        <w:rPr/>
+      </w:pPr>
+      <w:r>
+        <w:rPr>
+          <w:b w:val="1"/>
+          <w:bCs w:val="1"/>
+          <w:rtl w:val="0"/>
+        </w:rPr>
+        <w:t xml:space="preserve">Elección del servicio y del peluquero.</w:t>
+      </w:r>
+      <w:r>
+        <w:rPr>
+          <w:rtl w:val="0"/>
+        </w:rPr>
+        <w:t xml:space="preserve"> Se elige el servicio y se asigna el peluquero. El sistema verifica que ese peluquero tenga el servicio habilitado. Si no lo tiene, muestra un error y se debe asignar otro peluquero.</w:t>
+      </w:r>
+    </w:p>
+    <w:p>
+      <w:pPr>
+        <w:numPr>
+          <w:ilvl w:val="0"/>
+          <w:numId w:val="7"/>
+        </w:numPr>
+        <w:spacing w:after="0" w:afterAutospacing="0" w:before="0" w:beforeAutospacing="0" w:lineRule="auto"/>
+        <w:ind w:left="720" w:hanging="360"/>
+        <w:rPr/>
+      </w:pPr>
+      <w:r>
+        <w:rPr>
+          <w:b w:val="1"/>
+          <w:bCs w:val="1"/>
+          <w:rtl w:val="0"/>
+        </w:rPr>
+        <w:t xml:space="preserve">Registro del servicio.</w:t>
+      </w:r>
+      <w:r>
+        <w:rPr>
+          <w:rtl w:val="0"/>
+        </w:rPr>
+        <w:t xml:space="preserve"> Con un peluquero válido se abre la ficha de atención. El primer servicio la crea y los siguientes se agregan a la misma ficha. Luego el sistema consulta si el peluquero es externo. Si lo es, el servicio se registra con el precio y la comisión vigentes. Si es de planta, que recibe sueldo fijo, se registra solo con el precio vigente y sin comisión.</w:t>
+      </w:r>
+    </w:p>
+    <w:p>
+      <w:pPr>
+        <w:numPr>
+          <w:ilvl w:val="0"/>
+          <w:numId w:val="7"/>
+        </w:numPr>
+        <w:spacing w:after="0" w:afterAutospacing="0" w:before="0" w:beforeAutospacing="0" w:lineRule="auto"/>
+        <w:ind w:left="720" w:hanging="360"/>
+        <w:rPr/>
+      </w:pPr>
+      <w:r>
+        <w:rPr>
+          <w:b w:val="1"/>
+          <w:bCs w:val="1"/>
+          <w:rtl w:val="0"/>
+        </w:rPr>
+        <w:t xml:space="preserve">Atención del servicio.</w:t>
+      </w:r>
+      <w:r>
+        <w:rPr>
+          <w:rtl w:val="0"/>
+        </w:rPr>
+        <w:t xml:space="preserve"> Se inicia el servicio, se registran los insumos utilizados y se termina. Los servicios se atienden de a uno, porque cada uno toma su tiempo.</w:t>
+      </w:r>
+    </w:p>
+    <w:p>
+      <w:pPr>
+        <w:numPr>
+          <w:ilvl w:val="0"/>
+          <w:numId w:val="7"/>
+        </w:numPr>
+        <w:spacing w:after="0" w:afterAutospacing="0" w:before="0" w:beforeAutospacing="0" w:lineRule="auto"/>
+        <w:ind w:left="720" w:hanging="360"/>
+        <w:rPr/>
+      </w:pPr>
+      <w:r>
+        <w:rPr>
+          <w:b w:val="1"/>
+          <w:bCs w:val="1"/>
+          <w:rtl w:val="0"/>
+        </w:rPr>
+        <w:t xml:space="preserve">Servicios adicionales.</w:t>
+      </w:r>
+      <w:r>
+        <w:rPr>
+          <w:rtl w:val="0"/>
+        </w:rPr>
+        <w:t xml:space="preserve"> Al terminar, se consulta si hay más servicios en la ficha. Si el cliente pide otro (por ejemplo, un corte después de una coloración), el flujo vuelve a la elección del servicio, y cada servicio queda con su propio precio y comisión.</w:t>
+      </w:r>
+    </w:p>
+    <w:p>
+      <w:pPr>
+        <w:numPr>
+          <w:ilvl w:val="0"/>
+          <w:numId w:val="7"/>
+        </w:numPr>
+        <w:spacing w:after="0" w:afterAutospacing="0" w:before="0" w:beforeAutospacing="0" w:lineRule="auto"/>
+        <w:ind w:left="720" w:hanging="360"/>
+        <w:rPr/>
+      </w:pPr>
+      <w:r>
+        <w:rPr>
+          <w:b w:val="1"/>
+          <w:bCs w:val="1"/>
+          <w:rtl w:val="0"/>
+        </w:rPr>
+        <w:t xml:space="preserve">Cierre de la ficha.</w:t>
+      </w:r>
+      <w:r>
+        <w:rPr>
+          <w:rtl w:val="0"/>
+        </w:rPr>
+        <w:t xml:space="preserve"> Cuando no hay más servicios, se valida la ficha y se programan las valoraciones de seguimiento.</w:t>
+      </w:r>
+    </w:p>
+    <w:p>
+      <w:pPr>
+        <w:numPr>
+          <w:ilvl w:val="0"/>
+          <w:numId w:val="7"/>
+        </w:numPr>
+        <w:spacing w:after="240" w:before="0" w:beforeAutospacing="0" w:lineRule="auto"/>
+        <w:ind w:left="720" w:hanging="360"/>
+        <w:rPr/>
+      </w:pPr>
+      <w:r>
+        <w:rPr>
+          <w:b w:val="1"/>
+          <w:bCs w:val="1"/>
+          <w:rtl w:val="0"/>
+        </w:rPr>
+        <w:t xml:space="preserve">Valoración del cliente.</w:t>
+      </w:r>
+      <w:r>
+        <w:rPr>
+          <w:rtl w:val="0"/>
+        </w:rPr>
+        <w:t xml:space="preserve"> En la fecha programada, el sistema envía la valoración por correo electrónico. Si el cliente responde, se registra su respuesta. Si no responde, la valoración se marca sin respuesta, y con eso termina el flujo.</w:t>
+      </w:r>
+    </w:p>
+    <w:p>
+      <w:pPr>
         <w:spacing w:after="120" w:lineRule="auto"/>
-        <w:rPr/>
-      </w:pPr>
-      <w:r>
         <w:rPr>
           <w:i w:val="1"/>
           <w:iCs w:val="1"/>
           <w:color w:val="7f7f7f"/>
-          <w:rtl w:val="0"/>
-        </w:rPr>
-        <w:t xml:space="preserve">[]</w:t>
-      </w:r>
+        </w:rPr>
+      </w:pPr>
       <w:r>
         <w:rPr>
           <w:rtl w:val="0"/>
@@ -25528,30 +25897,238 @@
     </w:p>
     <w:p>
       <w:pPr>
-        <w:pStyle w:val="Heading3"/>
-        <w:rPr/>
-      </w:pPr>
-      <w:r>
-        <w:rPr>
-          <w:rtl w:val="0"/>
-        </w:rPr>
-        <w:t xml:space="preserve">4.4.3. Descripción del diagrama de actividad</w:t>
-      </w:r>
-    </w:p>
-    <w:p>
-      <w:pPr>
         <w:spacing w:after="120" w:lineRule="auto"/>
-        <w:rPr/>
-      </w:pPr>
-      <w:r>
         <w:rPr>
           <w:i w:val="1"/>
           <w:iCs w:val="1"/>
           <w:color w:val="7f7f7f"/>
-          <w:rtl w:val="0"/>
-        </w:rPr>
-        <w:t xml:space="preserve">[]</w:t>
-      </w:r>
+        </w:rPr>
+      </w:pPr>
+      <w:r>
+        <w:rPr>
+          <w:rtl w:val="0"/>
+        </w:rPr>
+      </w:r>
+    </w:p>
+    <w:p>
+      <w:pPr>
+        <w:spacing w:after="120" w:lineRule="auto"/>
+        <w:rPr>
+          <w:i w:val="1"/>
+          <w:iCs w:val="1"/>
+          <w:color w:val="7f7f7f"/>
+        </w:rPr>
+      </w:pPr>
+      <w:r>
+        <w:rPr>
+          <w:rtl w:val="0"/>
+        </w:rPr>
+      </w:r>
+    </w:p>
+    <w:p>
+      <w:pPr>
+        <w:spacing w:after="120" w:lineRule="auto"/>
+        <w:rPr>
+          <w:i w:val="1"/>
+          <w:iCs w:val="1"/>
+          <w:color w:val="7f7f7f"/>
+        </w:rPr>
+      </w:pPr>
+      <w:r>
+        <w:rPr>
+          <w:rtl w:val="0"/>
+        </w:rPr>
+      </w:r>
+    </w:p>
+    <w:p>
+      <w:pPr>
+        <w:spacing w:after="120" w:lineRule="auto"/>
+        <w:rPr>
+          <w:i w:val="1"/>
+          <w:iCs w:val="1"/>
+          <w:color w:val="7f7f7f"/>
+        </w:rPr>
+      </w:pPr>
+      <w:r>
+        <w:rPr>
+          <w:rtl w:val="0"/>
+        </w:rPr>
+      </w:r>
+    </w:p>
+    <w:p>
+      <w:pPr>
+        <w:spacing w:after="120" w:lineRule="auto"/>
+        <w:rPr>
+          <w:i w:val="1"/>
+          <w:iCs w:val="1"/>
+          <w:color w:val="7f7f7f"/>
+        </w:rPr>
+      </w:pPr>
+      <w:r>
+        <w:rPr>
+          <w:rtl w:val="0"/>
+        </w:rPr>
+      </w:r>
+    </w:p>
+    <w:p>
+      <w:pPr>
+        <w:spacing w:after="120" w:lineRule="auto"/>
+        <w:rPr>
+          <w:i w:val="1"/>
+          <w:iCs w:val="1"/>
+          <w:color w:val="7f7f7f"/>
+        </w:rPr>
+      </w:pPr>
+      <w:r>
+        <w:rPr>
+          <w:rtl w:val="0"/>
+        </w:rPr>
+      </w:r>
+    </w:p>
+    <w:p>
+      <w:pPr>
+        <w:spacing w:after="120" w:lineRule="auto"/>
+        <w:rPr>
+          <w:i w:val="1"/>
+          <w:iCs w:val="1"/>
+          <w:color w:val="7f7f7f"/>
+        </w:rPr>
+      </w:pPr>
+      <w:r>
+        <w:rPr>
+          <w:rtl w:val="0"/>
+        </w:rPr>
+      </w:r>
+    </w:p>
+    <w:p>
+      <w:pPr>
+        <w:spacing w:after="120" w:lineRule="auto"/>
+        <w:rPr>
+          <w:i w:val="1"/>
+          <w:iCs w:val="1"/>
+          <w:color w:val="7f7f7f"/>
+        </w:rPr>
+      </w:pPr>
+      <w:r>
+        <w:rPr>
+          <w:rtl w:val="0"/>
+        </w:rPr>
+      </w:r>
+    </w:p>
+    <w:p>
+      <w:pPr>
+        <w:spacing w:after="120" w:lineRule="auto"/>
+        <w:rPr>
+          <w:i w:val="1"/>
+          <w:iCs w:val="1"/>
+          <w:color w:val="7f7f7f"/>
+        </w:rPr>
+      </w:pPr>
+      <w:r>
+        <w:rPr>
+          <w:rtl w:val="0"/>
+        </w:rPr>
+      </w:r>
+    </w:p>
+    <w:p>
+      <w:pPr>
+        <w:spacing w:after="120" w:lineRule="auto"/>
+        <w:rPr>
+          <w:i w:val="1"/>
+          <w:iCs w:val="1"/>
+          <w:color w:val="7f7f7f"/>
+        </w:rPr>
+      </w:pPr>
+      <w:r>
+        <w:rPr>
+          <w:rtl w:val="0"/>
+        </w:rPr>
+      </w:r>
+    </w:p>
+    <w:p>
+      <w:pPr>
+        <w:spacing w:after="120" w:lineRule="auto"/>
+        <w:rPr>
+          <w:i w:val="1"/>
+          <w:iCs w:val="1"/>
+          <w:color w:val="7f7f7f"/>
+        </w:rPr>
+      </w:pPr>
+      <w:r>
+        <w:rPr>
+          <w:rtl w:val="0"/>
+        </w:rPr>
+      </w:r>
+    </w:p>
+    <w:p>
+      <w:pPr>
+        <w:spacing w:after="120" w:lineRule="auto"/>
+        <w:rPr>
+          <w:i w:val="1"/>
+          <w:iCs w:val="1"/>
+          <w:color w:val="7f7f7f"/>
+        </w:rPr>
+      </w:pPr>
+      <w:r>
+        <w:rPr>
+          <w:rtl w:val="0"/>
+        </w:rPr>
+      </w:r>
+    </w:p>
+    <w:p>
+      <w:pPr>
+        <w:spacing w:after="120" w:lineRule="auto"/>
+        <w:rPr>
+          <w:i w:val="1"/>
+          <w:iCs w:val="1"/>
+          <w:color w:val="7f7f7f"/>
+        </w:rPr>
+      </w:pPr>
+      <w:r>
+        <w:rPr>
+          <w:rtl w:val="0"/>
+        </w:rPr>
+      </w:r>
+    </w:p>
+    <w:p>
+      <w:pPr>
+        <w:spacing w:after="120" w:lineRule="auto"/>
+        <w:rPr>
+          <w:i w:val="1"/>
+          <w:iCs w:val="1"/>
+          <w:color w:val="7f7f7f"/>
+        </w:rPr>
+      </w:pPr>
+      <w:r>
+        <w:rPr>
+          <w:rtl w:val="0"/>
+        </w:rPr>
+      </w:r>
+    </w:p>
+    <w:p>
+      <w:pPr>
+        <w:spacing w:after="120" w:lineRule="auto"/>
+        <w:rPr>
+          <w:i w:val="1"/>
+          <w:iCs w:val="1"/>
+          <w:color w:val="7f7f7f"/>
+        </w:rPr>
+      </w:pPr>
+      <w:r>
+        <w:rPr>
+          <w:rtl w:val="0"/>
+        </w:rPr>
+      </w:r>
+    </w:p>
+    <w:p>
+      <w:pPr>
+        <w:spacing w:after="120" w:lineRule="auto"/>
+        <w:rPr>
+          <w:i w:val="1"/>
+          <w:iCs w:val="1"/>
+          <w:color w:val="7f7f7f"/>
+        </w:rPr>
+      </w:pPr>
       <w:r>
         <w:rPr>
           <w:rtl w:val="0"/>
@@ -25591,16 +26168,16 @@
           <wp:inline distB="114300" distT="114300" distL="114300" distR="114300">
             <wp:extent cx="5943600" cy="5892800"/>
             <wp:effectExtent b="0" l="0" r="0" t="0"/>
-            <wp:docPr id="1" name="image2.png"/>
+            <wp:docPr id="1" name="image3.png"/>
             <a:graphic>
               <a:graphicData uri="http://schemas.openxmlformats.org/drawingml/2006/picture">
                 <pic:pic>
                   <pic:nvPicPr>
-                    <pic:cNvPr id="0" name="image2.png"/>
+                    <pic:cNvPr id="0" name="image3.png"/>
                     <pic:cNvPicPr preferRelativeResize="0"/>
                   </pic:nvPicPr>
                   <pic:blipFill>
-                    <a:blip r:embed="rId13"/>
+                    <a:blip r:embed="rId14"/>
                     <a:srcRect b="0" l="0" r="0" t="0"/>
                     <a:stretch>
                       <a:fillRect/>
@@ -28985,8 +29562,8 @@
       </w:r>
     </w:p>
     <w:sectPr>
-      <w:headerReference r:id="rId14" w:type="default"/>
-      <w:footerReference r:id="rId15" w:type="default"/>
+      <w:headerReference r:id="rId15" w:type="default"/>
+      <w:footerReference r:id="rId16" w:type="default"/>
       <w:pgSz w:h="15840" w:w="12240" w:orient="portrait"/>
       <w:pgMar w:bottom="1440" w:top="1440" w:left="1440" w:right="1440" w:header="708" w:footer="708"/>
       <w:pgNumType w:start="1"/>
@@ -29732,6 +30309,116 @@
       </w:rPr>
     </w:lvl>
   </w:abstractNum>
+  <w:abstractNum w:abstractNumId="7">
+    <w:lvl w:ilvl="0">
+      <w:start w:val="1"/>
+      <w:numFmt w:val="decimal"/>
+      <w:lvlText w:val="%1."/>
+      <w:lvlJc w:val="left"/>
+      <w:pPr>
+        <w:ind w:left="720" w:hanging="360"/>
+      </w:pPr>
+      <w:rPr>
+        <w:u w:val="none"/>
+      </w:rPr>
+    </w:lvl>
+    <w:lvl w:ilvl="1">
+      <w:start w:val="1"/>
+      <w:numFmt w:val="lowerLetter"/>
+      <w:lvlText w:val="%2."/>
+      <w:lvlJc w:val="left"/>
+      <w:pPr>
+        <w:ind w:left="1440" w:hanging="360"/>
+      </w:pPr>
+      <w:rPr>
+        <w:u w:val="none"/>
+      </w:rPr>
+    </w:lvl>
+    <w:lvl w:ilvl="2">
+      <w:start w:val="1"/>
+      <w:numFmt w:val="lowerRoman"/>
+      <w:lvlText w:val="%3."/>
+      <w:lvlJc w:val="left"/>
+      <w:pPr>
+        <w:ind w:left="2160" w:hanging="360"/>
+      </w:pPr>
+      <w:rPr>
+        <w:u w:val="none"/>
+      </w:rPr>
+    </w:lvl>
+    <w:lvl w:ilvl="3">
+      <w:start w:val="1"/>
+      <w:numFmt w:val="decimal"/>
+      <w:lvlText w:val="%4."/>
+      <w:lvlJc w:val="left"/>
+      <w:pPr>
+        <w:ind w:left="2880" w:hanging="360"/>
+      </w:pPr>
+      <w:rPr>
+        <w:u w:val="none"/>
+      </w:rPr>
+    </w:lvl>
+    <w:lvl w:ilvl="4">
+      <w:start w:val="1"/>
+      <w:numFmt w:val="lowerLetter"/>
+      <w:lvlText w:val="%5."/>
+      <w:lvlJc w:val="left"/>
+      <w:pPr>
+        <w:ind w:left="3600" w:hanging="360"/>
+      </w:pPr>
+      <w:rPr>
+        <w:u w:val="none"/>
+      </w:rPr>
+    </w:lvl>
+    <w:lvl w:ilvl="5">
+      <w:start w:val="1"/>
+      <w:numFmt w:val="lowerRoman"/>
+      <w:lvlText w:val="%6."/>
+      <w:lvlJc w:val="left"/>
+      <w:pPr>
+        <w:ind w:left="4320" w:hanging="360"/>
+      </w:pPr>
+      <w:rPr>
+        <w:u w:val="none"/>
+      </w:rPr>
+    </w:lvl>
+    <w:lvl w:ilvl="6">
+      <w:start w:val="1"/>
+      <w:numFmt w:val="decimal"/>
+      <w:lvlText w:val="%7."/>
+      <w:lvlJc w:val="left"/>
+      <w:pPr>
+        <w:ind w:left="5040" w:hanging="360"/>
+      </w:pPr>
+      <w:rPr>
+        <w:u w:val="none"/>
+      </w:rPr>
+    </w:lvl>
+    <w:lvl w:ilvl="7">
+      <w:start w:val="1"/>
+      <w:numFmt w:val="lowerLetter"/>
+      <w:lvlText w:val="%8."/>
+      <w:lvlJc w:val="left"/>
+      <w:pPr>
+        <w:ind w:left="5760" w:hanging="360"/>
+      </w:pPr>
+      <w:rPr>
+        <w:u w:val="none"/>
+      </w:rPr>
+    </w:lvl>
+    <w:lvl w:ilvl="8">
+      <w:start w:val="1"/>
+      <w:numFmt w:val="lowerRoman"/>
+      <w:lvlText w:val="%9."/>
+      <w:lvlJc w:val="left"/>
+      <w:pPr>
+        <w:ind w:left="6480" w:hanging="360"/>
+      </w:pPr>
+      <w:rPr>
+        <w:u w:val="none"/>
+      </w:rPr>
+    </w:lvl>
+  </w:abstractNum>
   <w:num w:numId="1">
     <w:abstractNumId w:val="1"/>
   </w:num>
@@ -29749,6 +30436,9 @@
   </w:num>
   <w:num w:numId="6">
     <w:abstractNumId w:val="6"/>
+  </w:num>
+  <w:num w:numId="7">
+    <w:abstractNumId w:val="7"/>
   </w:num>
 </w:numbering>
 </file>

</xml_diff>